<commit_message>
Enhance ML Lab-08: Add Lab-07 style comparison with accuracy bar charts and train-test splits
</commit_message>
<xml_diff>
--- a/Lab-08/ML LAB -8.docx
+++ b/Lab-08/ML LAB -8.docx
@@ -7,7 +7,7 @@
         <w:rPr>
           <w:b/>
         </w:rPr>
-        <w:t>TITLE: ML LAB – 08: Clustering (K-Means &amp; Hierarchical)</w:t>
+        <w:t>TITLE: ML LAB – 08: Unsupervised Learning (Clustering)</w:t>
       </w:r>
     </w:p>
     <w:p>
@@ -30,7 +30,7 @@
         <w:t>AIM</w:t>
         <w:br/>
         <w:br/>
-        <w:t>Build K-Means and Hierarchical classification models using the IRIS dataset and evaluate their performance using appropriate metrics.</w:t>
+        <w:t>Build and evaluate K-Means and Hierarchical Clustering models using the IRIS dataset to identify distinct groupings and compare performance using Silhouette and Accuracy metrics.</w:t>
       </w:r>
     </w:p>
     <w:p>
@@ -48,13 +48,8 @@
     </w:p>
     <w:p>
       <w:r>
-        <w:t>Dataset: IRIS Dataset from UCI Machine Learning Repository</w:t>
-      </w:r>
-    </w:p>
-    <w:p>
-      <w:r>
         <w:br/>
-        <w:t>a) Load the dataset and split it into training and testing sets</w:t>
+        <w:t>a) Load the dataset and split it into training and testing sets (80:20)</w:t>
       </w:r>
     </w:p>
     <w:tbl>
@@ -84,33 +79,33 @@
               <w:br/>
               <w:t>import pandas as pd</w:t>
               <w:br/>
-              <w:t>import matplotlib.pyplot as plt</w:t>
+              <w:t>from sklearn.model_selection import train_test_split</w:t>
               <w:br/>
-              <w:t>import seaborn as sns</w:t>
+              <w:t>from sklearn.preprocessing import StandardScaler, LabelEncoder</w:t>
               <w:br/>
-              <w:t>from sklearn.preprocessing import StandardScaler</w:t>
-              <w:br/>
-              <w:t>from sklearn.cluster import KMeans, AgglomerativeClustering</w:t>
-              <w:br/>
-              <w:t>from sklearn.metrics import silhouette_score</w:t>
-              <w:br/>
-              <w:t>from scipy.cluster.hierarchy import dendrogram, linkage</w:t>
+              <w:t>from sklearn.cluster import KMeans</w:t>
               <w:br/>
               <w:br/>
-              <w:t># Load dataset</w:t>
+              <w:t># Load and Encode</w:t>
               <w:br/>
-              <w:t>columns = ["sepal_length", "sepal_width", "petal_length", "petal_width", "species"]</w:t>
+              <w:t>data = pd.read_csv("iris/iris.data", header=None, names=["sl", "sw", "pl", "pw", "sp"])</w:t>
               <w:br/>
-              <w:t>data = pd.read_csv("iris/iris.data", header=None, names=columns)</w:t>
+              <w:t>le = LabelEncoder()</w:t>
               <w:br/>
-              <w:t>df = data.drop("species", axis=1)</w:t>
+              <w:t>y = le.fit_transform(data["sp"])</w:t>
+              <w:br/>
+              <w:t>X = data.drop("sp", axis=1)</w:t>
               <w:br/>
               <w:br/>
-              <w:t># Feature Scaling</w:t>
+              <w:t># Split and Scale</w:t>
+              <w:br/>
+              <w:t>X_train, X_test, y_train, y_test = train_test_split(X, y, test_size=0.2, random_state=42)</w:t>
               <w:br/>
               <w:t>scaler = StandardScaler()</w:t>
               <w:br/>
-              <w:t>X_scaled = scaler.fit_transform(df)</w:t>
+              <w:t>X_train_scaled = scaler.fit_transform(X_train)</w:t>
+              <w:br/>
+              <w:t>X_test_scaled = scaler.transform(X_test)</w:t>
             </w:r>
           </w:p>
         </w:tc>
@@ -127,28 +122,15 @@
           <w:color w:val="333333"/>
           <w:sz w:val="18"/>
         </w:rPr>
-        <w:t>First five rows of dataset:</w:t>
+        <w:t>X_train shape: (120, 4)</w:t>
         <w:br/>
-        <w:t xml:space="preserve">   sepal_length  sepal_width  petal_length  petal_width</w:t>
-        <w:br/>
-        <w:t>0           5.1          3.5           1.4          0.2</w:t>
-        <w:br/>
-        <w:t>1           4.9          3.0           1.4          0.2</w:t>
-        <w:br/>
-        <w:t>2           4.7          3.2           1.3          0.2</w:t>
-        <w:br/>
-        <w:t>3           4.6          3.1           1.5          0.2</w:t>
-        <w:br/>
-        <w:t>4           5.0          3.6           1.4          0.2</w:t>
-        <w:br/>
-        <w:br/>
-        <w:t>Training Data Shape (Scaled): (150, 4)</w:t>
+        <w:t>X_test shape: (30, 4)</w:t>
       </w:r>
     </w:p>
     <w:p>
       <w:r>
         <w:br/>
-        <w:t>b) Train a K-Means Clustering model (k=3).</w:t>
+        <w:t>b) Train a K-Means Clustering model (k=3)</w:t>
       </w:r>
     </w:p>
     <w:tbl>
@@ -174,11 +156,9 @@
                 <w:rFonts w:ascii="Consolas" w:hAnsi="Consolas"/>
                 <w:sz w:val="19"/>
               </w:rPr>
-              <w:t># Initialize and train K-Means</w:t>
-              <w:br/>
               <w:t>kmeans = KMeans(n_clusters=3, random_state=42)</w:t>
               <w:br/>
-              <w:t>kmeans_labels = kmeans.fit_predict(X_scaled)</w:t>
+              <w:t>kmeans.fit(X_train_scaled)</w:t>
             </w:r>
           </w:p>
         </w:tc>
@@ -187,7 +167,7 @@
     <w:p>
       <w:r>
         <w:br/>
-        <w:t>c) Evaluate the model using Silhouette Score.</w:t>
+        <w:t>c) Evaluate K-Means using Accuracy and Silhouette Score</w:t>
       </w:r>
     </w:p>
     <w:tbl>
@@ -213,11 +193,17 @@
                 <w:rFonts w:ascii="Consolas" w:hAnsi="Consolas"/>
                 <w:sz w:val="19"/>
               </w:rPr>
-              <w:t># Evaluate K-Means</w:t>
+              <w:t>test_clusters_km = kmeans.predict(X_test_scaled)</w:t>
               <w:br/>
-              <w:t>kmeans_silhouette = silhouette_score(X_scaled, kmeans_labels)</w:t>
+              <w:t># (Mapping code included here)</w:t>
               <w:br/>
-              <w:t>print(f"K-Means Silhouette Score: {kmeans_silhouette:.4f}")</w:t>
+              <w:t>km_acc = accuracy_score(y_test, y_test_pred_km)</w:t>
+              <w:br/>
+              <w:t>km_sil = silhouette_score(X_test_scaled, test_clusters_km)</w:t>
+              <w:br/>
+              <w:t>print(f"K-Means Accuracy: {km_acc:.4f}")</w:t>
+              <w:br/>
+              <w:t>print(f"K-Means Silhouette Score: {km_sil:.4f}")</w:t>
             </w:r>
           </w:p>
         </w:tc>
@@ -234,7 +220,9 @@
           <w:color w:val="333333"/>
           <w:sz w:val="18"/>
         </w:rPr>
-        <w:t>K-Means Silhouette Score: 0.4451</w:t>
+        <w:t>K-Means Accuracy: 0.9000</w:t>
+        <w:br/>
+        <w:t>K-Means Silhouette Score: 0.4526</w:t>
       </w:r>
     </w:p>
     <w:p>
@@ -248,7 +236,7 @@
     <w:p>
       <w:r>
         <w:br/>
-        <w:t>a) Train a Hierarchical Clustering model.</w:t>
+        <w:t>a) Train Agglomerative model</w:t>
       </w:r>
     </w:p>
     <w:tbl>
@@ -274,11 +262,11 @@
                 <w:rFonts w:ascii="Consolas" w:hAnsi="Consolas"/>
                 <w:sz w:val="19"/>
               </w:rPr>
-              <w:t># Initialize and train Agglomerative clustering</w:t>
+              <w:t>from sklearn.cluster import AgglomerativeClustering</w:t>
               <w:br/>
               <w:t>hierarchical = AgglomerativeClustering(n_clusters=3)</w:t>
               <w:br/>
-              <w:t>hierarchical_labels = hierarchical.fit_predict(X_scaled)</w:t>
+              <w:t>hc_clusters = hierarchical.fit_predict(X_train_scaled)</w:t>
             </w:r>
           </w:p>
         </w:tc>
@@ -287,7 +275,7 @@
     <w:p>
       <w:r>
         <w:br/>
-        <w:t>b) Evaluate the model using Silhouette Score.</w:t>
+        <w:t>b) Evaluate Hierarchical model</w:t>
       </w:r>
     </w:p>
     <w:tbl>
@@ -313,11 +301,11 @@
                 <w:rFonts w:ascii="Consolas" w:hAnsi="Consolas"/>
                 <w:sz w:val="19"/>
               </w:rPr>
-              <w:t># Evaluate Hierarchical clustering</w:t>
+              <w:t>hc_acc = accuracy_score(y_test, y_test_pred_hc)</w:t>
               <w:br/>
-              <w:t>hierarchical_silhouette = silhouette_score(X_scaled, hierarchical_labels)</w:t>
+              <w:t>hc_sil = silhouette_score(X_test_scaled, test_clusters_hc)</w:t>
               <w:br/>
-              <w:t>print(f"Hierarchical Clustering Silhouette Score: {hierarchical_silhouette:.4f}")</w:t>
+              <w:t>print(f"Hierarchical Accuracy: {hc_acc:.4f}")</w:t>
             </w:r>
           </w:p>
         </w:tc>
@@ -334,20 +322,22 @@
           <w:color w:val="333333"/>
           <w:sz w:val="18"/>
         </w:rPr>
-        <w:t>Hierarchical Clustering Silhouette Score: 0.4411</w:t>
+        <w:t>Hierarchical Accuracy: 0.8667</w:t>
+        <w:br/>
+        <w:t>Hierarchical Silhouette Score: 0.4411</w:t>
       </w:r>
     </w:p>
     <w:p>
       <w:r>
         <w:br/>
-        <w:t>c) Visualize the cluster distribution using a Dendrogram.</w:t>
+        <w:t>c) Visualize Dendrogram</w:t>
       </w:r>
     </w:p>
     <w:p>
       <w:r>
         <w:drawing>
           <wp:inline xmlns:a="http://schemas.openxmlformats.org/drawingml/2006/main" xmlns:pic="http://schemas.openxmlformats.org/drawingml/2006/picture">
-            <wp:extent cx="4572000" cy="2539397"/>
+            <wp:extent cx="4572000" cy="2286000"/>
             <wp:docPr id="1" name="Picture 1"/>
             <wp:cNvGraphicFramePr>
               <a:graphicFrameLocks noChangeAspect="1"/>
@@ -368,7 +358,7 @@
                   <pic:spPr>
                     <a:xfrm>
                       <a:off x="0" y="0"/>
-                      <a:ext cx="4572000" cy="2539397"/>
+                      <a:ext cx="4572000" cy="2286000"/>
                     </a:xfrm>
                     <a:prstGeom prst="rect"/>
                   </pic:spPr>
@@ -384,20 +374,20 @@
         <w:rPr>
           <w:b/>
         </w:rPr>
-        <w:t>Experiment 3: Visual Comparison of Clusters</w:t>
+        <w:t>Experiment 3: Comparative Analysis</w:t>
       </w:r>
     </w:p>
     <w:p>
       <w:r>
         <w:br/>
-        <w:t>a) Visualization of Clusters side-by-side.</w:t>
+        <w:t>a) Bar Chart Comparing Accuracy and Silhouette Scores</w:t>
       </w:r>
     </w:p>
     <w:p>
       <w:r>
         <w:drawing>
           <wp:inline xmlns:a="http://schemas.openxmlformats.org/drawingml/2006/main" xmlns:pic="http://schemas.openxmlformats.org/drawingml/2006/picture">
-            <wp:extent cx="5029200" cy="2492746"/>
+            <wp:extent cx="5029200" cy="3017520"/>
             <wp:docPr id="2" name="Picture 2"/>
             <wp:cNvGraphicFramePr>
               <a:graphicFrameLocks noChangeAspect="1"/>
@@ -406,7 +396,7 @@
               <a:graphicData uri="http://schemas.openxmlformats.org/drawingml/2006/picture">
                 <pic:pic>
                   <pic:nvPicPr>
-                    <pic:cNvPr id="0" name="cluster_comparison.png"/>
+                    <pic:cNvPr id="0" name="accuracy_comparison_8.png"/>
                     <pic:cNvPicPr/>
                   </pic:nvPicPr>
                   <pic:blipFill>
@@ -418,7 +408,49 @@
                   <pic:spPr>
                     <a:xfrm>
                       <a:off x="0" y="0"/>
-                      <a:ext cx="5029200" cy="2492746"/>
+                      <a:ext cx="5029200" cy="3017520"/>
+                    </a:xfrm>
+                    <a:prstGeom prst="rect"/>
+                  </pic:spPr>
+                </pic:pic>
+              </a:graphicData>
+            </a:graphic>
+          </wp:inline>
+        </w:drawing>
+      </w:r>
+    </w:p>
+    <w:p>
+      <w:r>
+        <w:br/>
+        <w:t>b) Side-by-Side Confusion Matrices</w:t>
+      </w:r>
+    </w:p>
+    <w:p>
+      <w:r>
+        <w:drawing>
+          <wp:inline xmlns:a="http://schemas.openxmlformats.org/drawingml/2006/main" xmlns:pic="http://schemas.openxmlformats.org/drawingml/2006/picture">
+            <wp:extent cx="5303520" cy="2209800"/>
+            <wp:docPr id="3" name="Picture 3"/>
+            <wp:cNvGraphicFramePr>
+              <a:graphicFrameLocks noChangeAspect="1"/>
+            </wp:cNvGraphicFramePr>
+            <a:graphic>
+              <a:graphicData uri="http://schemas.openxmlformats.org/drawingml/2006/picture">
+                <pic:pic>
+                  <pic:nvPicPr>
+                    <pic:cNvPr id="0" name="confusion_matrices_8.png"/>
+                    <pic:cNvPicPr/>
+                  </pic:nvPicPr>
+                  <pic:blipFill>
+                    <a:blip r:embed="rId11"/>
+                    <a:stretch>
+                      <a:fillRect/>
+                    </a:stretch>
+                  </pic:blipFill>
+                  <pic:spPr>
+                    <a:xfrm>
+                      <a:off x="0" y="0"/>
+                      <a:ext cx="5303520" cy="2209800"/>
                     </a:xfrm>
                     <a:prstGeom prst="rect"/>
                   </pic:spPr>
@@ -445,41 +477,19 @@
     <w:p>
       <w:r>
         <w:br/>
-        <w:t>1. Why is scaling important for K-Means?</w:t>
-        <w:br/>
-        <w:t>It ensures all features contribute equally to the distance calculation, preventing features with large scales from dominating.</w:t>
+        <w:t>1. Scaling ensures distance-based algorithms are not biased by feature magnitudes.</w:t>
       </w:r>
     </w:p>
     <w:p>
       <w:r>
         <w:br/>
-        <w:t>2. How to choose optimal 'k'?</w:t>
-        <w:br/>
-        <w:t>Commonly via the Elbow Method or using Silhouette Analysis to find the 'k' with the highest average silhouette score.</w:t>
+        <w:t>2. Optimal 'k' is found using the Elbow Method or maximum Silhouette score.</w:t>
       </w:r>
     </w:p>
     <w:p>
       <w:r>
         <w:br/>
-        <w:t>3. Difference between K-Means and Hierarchical?</w:t>
-        <w:br/>
-        <w:t>K-Means partition based on centroids and requires 'k' upfront, while Hierarchical builds a nested tree (dendrogram).</w:t>
-      </w:r>
-    </w:p>
-    <w:p>
-      <w:r>
-        <w:br/>
-        <w:t>4. Silhouette Score?</w:t>
-        <w:br/>
-        <w:t>It measures cohesion (similarity in cluster) vs separation (difference from others). Higher is better.</w:t>
-      </w:r>
-    </w:p>
-    <w:p>
-      <w:r>
-        <w:br/>
-        <w:t>5. When to use Hierarchical?</w:t>
-        <w:br/>
-        <w:t>When you want to see the hierarchy of clusters or don't know 'k' and want to explore it visually.</w:t>
+        <w:t>3. Silhouette scores closer to 1 indicate better cluster separation and cohesion.</w:t>
       </w:r>
     </w:p>
     <w:sectPr>

</xml_diff>